<commit_message>
Finalize Flake8 fixes and lab documentation
</commit_message>
<xml_diff>
--- a/Issue_Table.docx
+++ b/Issue_Table.docx
@@ -15,6 +15,11 @@
     <w:p>
       <w:r>
         <w:t>5H</w:t>
+      </w:r>
+    </w:p>
+    <w:p>
+      <w:r>
+        <w:t>Lab 5</w:t>
       </w:r>
     </w:p>
     <w:p>
@@ -30,7 +35,7 @@
       <w:r>
         <w:t xml:space="preserve">#46 </w:t>
       </w:r>
-      <w:hyperlink r:id="rId4" w:history="1">
+      <w:hyperlink r:id="rId5" w:history="1">
         <w:r>
           <w:rPr>
             <w:rFonts w:ascii="Bookman Old Style" w:eastAsia="Times New Roman" w:hAnsi="Bookman Old Style" w:cs="Arial"/>
@@ -1653,6 +1658,1300 @@
       </w:r>
     </w:p>
     <w:p/>
+    <w:p/>
+    <w:p>
+      <w:pPr>
+        <w:rPr>
+          <w:b/>
+          <w:bCs/>
+          <w:sz w:val="28"/>
+          <w:szCs w:val="28"/>
+        </w:rPr>
+      </w:pPr>
+      <w:r>
+        <w:rPr>
+          <w:b/>
+          <w:bCs/>
+          <w:sz w:val="28"/>
+          <w:szCs w:val="28"/>
+        </w:rPr>
+        <w:t>After Fixes — Static Code Analysis</w:t>
+      </w:r>
+    </w:p>
+    <w:p>
+      <w:r>
+        <w:rPr>
+          <w:b/>
+          <w:bCs/>
+        </w:rPr>
+        <w:t>File analysed:</w:t>
+      </w:r>
+      <w:r>
+        <w:t xml:space="preserve"> hospital_patient_system.py</w:t>
+      </w:r>
+      <w:r>
+        <w:br/>
+      </w:r>
+      <w:r>
+        <w:rPr>
+          <w:b/>
+          <w:bCs/>
+        </w:rPr>
+        <w:t>Tools used:</w:t>
+      </w:r>
+      <w:r>
+        <w:t xml:space="preserve"> Pylint, Bandit, and Flake8</w:t>
+      </w:r>
+    </w:p>
+    <w:p>
+      <w:pPr>
+        <w:rPr>
+          <w:b/>
+          <w:bCs/>
+        </w:rPr>
+      </w:pPr>
+      <w:r>
+        <w:rPr>
+          <w:b/>
+          <w:bCs/>
+        </w:rPr>
+        <w:t>1. Issues Fixed</w:t>
+      </w:r>
+    </w:p>
+    <w:tbl>
+      <w:tblPr>
+        <w:tblW w:w="0" w:type="auto"/>
+        <w:tblCellSpacing w:w="15" w:type="dxa"/>
+        <w:tblBorders>
+          <w:top w:val="single" w:sz="4" w:space="0" w:color="auto"/>
+          <w:left w:val="single" w:sz="4" w:space="0" w:color="auto"/>
+          <w:bottom w:val="single" w:sz="4" w:space="0" w:color="auto"/>
+          <w:right w:val="single" w:sz="4" w:space="0" w:color="auto"/>
+          <w:insideH w:val="single" w:sz="4" w:space="0" w:color="auto"/>
+          <w:insideV w:val="single" w:sz="4" w:space="0" w:color="auto"/>
+        </w:tblBorders>
+        <w:tblCellMar>
+          <w:top w:w="15" w:type="dxa"/>
+          <w:left w:w="15" w:type="dxa"/>
+          <w:bottom w:w="15" w:type="dxa"/>
+          <w:right w:w="15" w:type="dxa"/>
+        </w:tblCellMar>
+        <w:tblLook w:val="04A0" w:firstRow="1" w:lastRow="0" w:firstColumn="1" w:lastColumn="0" w:noHBand="0" w:noVBand="1"/>
+      </w:tblPr>
+      <w:tblGrid>
+        <w:gridCol w:w="2498"/>
+        <w:gridCol w:w="5486"/>
+        <w:gridCol w:w="1032"/>
+      </w:tblGrid>
+      <w:tr>
+        <w:trPr>
+          <w:tblCellSpacing w:w="15" w:type="dxa"/>
+        </w:trPr>
+        <w:tc>
+          <w:tcPr>
+            <w:tcW w:w="0" w:type="auto"/>
+            <w:vAlign w:val="center"/>
+            <w:hideMark/>
+          </w:tcPr>
+          <w:p>
+            <w:pPr>
+              <w:rPr>
+                <w:b/>
+                <w:bCs/>
+              </w:rPr>
+            </w:pPr>
+            <w:r>
+              <w:rPr>
+                <w:b/>
+                <w:bCs/>
+              </w:rPr>
+              <w:lastRenderedPageBreak/>
+              <w:t>Issue identified in the original code</w:t>
+            </w:r>
+          </w:p>
+        </w:tc>
+        <w:tc>
+          <w:tcPr>
+            <w:tcW w:w="0" w:type="auto"/>
+            <w:vAlign w:val="center"/>
+            <w:hideMark/>
+          </w:tcPr>
+          <w:p>
+            <w:pPr>
+              <w:rPr>
+                <w:b/>
+                <w:bCs/>
+              </w:rPr>
+            </w:pPr>
+            <w:r>
+              <w:rPr>
+                <w:b/>
+                <w:bCs/>
+              </w:rPr>
+              <w:t>Fix applied</w:t>
+            </w:r>
+          </w:p>
+        </w:tc>
+        <w:tc>
+          <w:tcPr>
+            <w:tcW w:w="0" w:type="auto"/>
+            <w:vAlign w:val="center"/>
+            <w:hideMark/>
+          </w:tcPr>
+          <w:p>
+            <w:pPr>
+              <w:rPr>
+                <w:b/>
+                <w:bCs/>
+              </w:rPr>
+            </w:pPr>
+            <w:r>
+              <w:rPr>
+                <w:b/>
+                <w:bCs/>
+              </w:rPr>
+              <w:t>Final status</w:t>
+            </w:r>
+          </w:p>
+        </w:tc>
+      </w:tr>
+      <w:tr>
+        <w:trPr>
+          <w:tblCellSpacing w:w="15" w:type="dxa"/>
+        </w:trPr>
+        <w:tc>
+          <w:tcPr>
+            <w:tcW w:w="0" w:type="auto"/>
+            <w:vAlign w:val="center"/>
+            <w:hideMark/>
+          </w:tcPr>
+          <w:p>
+            <w:r>
+              <w:t>Mutable default argument</w:t>
+            </w:r>
+          </w:p>
+        </w:tc>
+        <w:tc>
+          <w:tcPr>
+            <w:tcW w:w="0" w:type="auto"/>
+            <w:vAlign w:val="center"/>
+            <w:hideMark/>
+          </w:tcPr>
+          <w:p>
+            <w:r>
+              <w:t>Replaced the default list with None and initialized a new list inside the function.</w:t>
+            </w:r>
+          </w:p>
+        </w:tc>
+        <w:tc>
+          <w:tcPr>
+            <w:tcW w:w="0" w:type="auto"/>
+            <w:vAlign w:val="center"/>
+            <w:hideMark/>
+          </w:tcPr>
+          <w:p>
+            <w:r>
+              <w:t>Fixed</w:t>
+            </w:r>
+          </w:p>
+        </w:tc>
+      </w:tr>
+      <w:tr>
+        <w:trPr>
+          <w:tblCellSpacing w:w="15" w:type="dxa"/>
+        </w:trPr>
+        <w:tc>
+          <w:tcPr>
+            <w:tcW w:w="0" w:type="auto"/>
+            <w:vAlign w:val="center"/>
+            <w:hideMark/>
+          </w:tcPr>
+          <w:p>
+            <w:r>
+              <w:t>Missing module docstring</w:t>
+            </w:r>
+          </w:p>
+        </w:tc>
+        <w:tc>
+          <w:tcPr>
+            <w:tcW w:w="0" w:type="auto"/>
+            <w:vAlign w:val="center"/>
+            <w:hideMark/>
+          </w:tcPr>
+          <w:p>
+            <w:r>
+              <w:t>Added a module-level description at the beginning of the file.</w:t>
+            </w:r>
+          </w:p>
+        </w:tc>
+        <w:tc>
+          <w:tcPr>
+            <w:tcW w:w="0" w:type="auto"/>
+            <w:vAlign w:val="center"/>
+            <w:hideMark/>
+          </w:tcPr>
+          <w:p>
+            <w:r>
+              <w:t>Fixed</w:t>
+            </w:r>
+          </w:p>
+        </w:tc>
+      </w:tr>
+      <w:tr>
+        <w:trPr>
+          <w:tblCellSpacing w:w="15" w:type="dxa"/>
+        </w:trPr>
+        <w:tc>
+          <w:tcPr>
+            <w:tcW w:w="0" w:type="auto"/>
+            <w:vAlign w:val="center"/>
+            <w:hideMark/>
+          </w:tcPr>
+          <w:p>
+            <w:r>
+              <w:t>Missing function docstrings</w:t>
+            </w:r>
+          </w:p>
+        </w:tc>
+        <w:tc>
+          <w:tcPr>
+            <w:tcW w:w="0" w:type="auto"/>
+            <w:vAlign w:val="center"/>
+            <w:hideMark/>
+          </w:tcPr>
+          <w:p>
+            <w:r>
+              <w:t>Added descriptions to the functions.</w:t>
+            </w:r>
+          </w:p>
+        </w:tc>
+        <w:tc>
+          <w:tcPr>
+            <w:tcW w:w="0" w:type="auto"/>
+            <w:vAlign w:val="center"/>
+            <w:hideMark/>
+          </w:tcPr>
+          <w:p>
+            <w:r>
+              <w:t>Fixed</w:t>
+            </w:r>
+          </w:p>
+        </w:tc>
+      </w:tr>
+      <w:tr>
+        <w:trPr>
+          <w:tblCellSpacing w:w="15" w:type="dxa"/>
+        </w:trPr>
+        <w:tc>
+          <w:tcPr>
+            <w:tcW w:w="0" w:type="auto"/>
+            <w:vAlign w:val="center"/>
+            <w:hideMark/>
+          </w:tcPr>
+          <w:p>
+            <w:r>
+              <w:t>Non-standard function name</w:t>
+            </w:r>
+          </w:p>
+        </w:tc>
+        <w:tc>
+          <w:tcPr>
+            <w:tcW w:w="0" w:type="auto"/>
+            <w:vAlign w:val="center"/>
+            <w:hideMark/>
+          </w:tcPr>
+          <w:p>
+            <w:r>
+              <w:t>Renamed admitPatient to admit_patient and updated its calls.</w:t>
+            </w:r>
+          </w:p>
+        </w:tc>
+        <w:tc>
+          <w:tcPr>
+            <w:tcW w:w="0" w:type="auto"/>
+            <w:vAlign w:val="center"/>
+            <w:hideMark/>
+          </w:tcPr>
+          <w:p>
+            <w:r>
+              <w:t>Fixed</w:t>
+            </w:r>
+          </w:p>
+        </w:tc>
+      </w:tr>
+      <w:tr>
+        <w:trPr>
+          <w:tblCellSpacing w:w="15" w:type="dxa"/>
+        </w:trPr>
+        <w:tc>
+          <w:tcPr>
+            <w:tcW w:w="0" w:type="auto"/>
+            <w:vAlign w:val="center"/>
+            <w:hideMark/>
+          </w:tcPr>
+          <w:p>
+            <w:r>
+              <w:t>Unused import</w:t>
+            </w:r>
+          </w:p>
+        </w:tc>
+        <w:tc>
+          <w:tcPr>
+            <w:tcW w:w="0" w:type="auto"/>
+            <w:vAlign w:val="center"/>
+            <w:hideMark/>
+          </w:tcPr>
+          <w:p>
+            <w:r>
+              <w:t>Removed or disabled unused imports. Retained math because it is used for numeric validation.</w:t>
+            </w:r>
+          </w:p>
+        </w:tc>
+        <w:tc>
+          <w:tcPr>
+            <w:tcW w:w="0" w:type="auto"/>
+            <w:vAlign w:val="center"/>
+            <w:hideMark/>
+          </w:tcPr>
+          <w:p>
+            <w:r>
+              <w:t>Fixed</w:t>
+            </w:r>
+          </w:p>
+        </w:tc>
+      </w:tr>
+      <w:tr>
+        <w:trPr>
+          <w:tblCellSpacing w:w="15" w:type="dxa"/>
+        </w:trPr>
+        <w:tc>
+          <w:tcPr>
+            <w:tcW w:w="0" w:type="auto"/>
+            <w:vAlign w:val="center"/>
+            <w:hideMark/>
+          </w:tcPr>
+          <w:p>
+            <w:r>
+              <w:t>Unused variable bed_charge</w:t>
+            </w:r>
+          </w:p>
+        </w:tc>
+        <w:tc>
+          <w:tcPr>
+            <w:tcW w:w="0" w:type="auto"/>
+            <w:vAlign w:val="center"/>
+            <w:hideMark/>
+          </w:tcPr>
+          <w:p>
+            <w:r>
+              <w:t>Removed the unnecessary variable assignment.</w:t>
+            </w:r>
+          </w:p>
+        </w:tc>
+        <w:tc>
+          <w:tcPr>
+            <w:tcW w:w="0" w:type="auto"/>
+            <w:vAlign w:val="center"/>
+            <w:hideMark/>
+          </w:tcPr>
+          <w:p>
+            <w:r>
+              <w:t>Fixed</w:t>
+            </w:r>
+          </w:p>
+        </w:tc>
+      </w:tr>
+      <w:tr>
+        <w:trPr>
+          <w:tblCellSpacing w:w="15" w:type="dxa"/>
+        </w:trPr>
+        <w:tc>
+          <w:tcPr>
+            <w:tcW w:w="0" w:type="auto"/>
+            <w:vAlign w:val="center"/>
+            <w:hideMark/>
+          </w:tcPr>
+          <w:p>
+            <w:r>
+              <w:t>Incorrect comparison with None</w:t>
+            </w:r>
+          </w:p>
+        </w:tc>
+        <w:tc>
+          <w:tcPr>
+            <w:tcW w:w="0" w:type="auto"/>
+            <w:vAlign w:val="center"/>
+            <w:hideMark/>
+          </w:tcPr>
+          <w:p>
+            <w:r>
+              <w:t>Used is None or is not None as appropriate.</w:t>
+            </w:r>
+          </w:p>
+        </w:tc>
+        <w:tc>
+          <w:tcPr>
+            <w:tcW w:w="0" w:type="auto"/>
+            <w:vAlign w:val="center"/>
+            <w:hideMark/>
+          </w:tcPr>
+          <w:p>
+            <w:r>
+              <w:t>Fixed</w:t>
+            </w:r>
+          </w:p>
+        </w:tc>
+      </w:tr>
+      <w:tr>
+        <w:trPr>
+          <w:tblCellSpacing w:w="15" w:type="dxa"/>
+        </w:trPr>
+        <w:tc>
+          <w:tcPr>
+            <w:tcW w:w="0" w:type="auto"/>
+            <w:vAlign w:val="center"/>
+            <w:hideMark/>
+          </w:tcPr>
+          <w:p>
+            <w:r>
+              <w:t>Unnecessary if/else</w:t>
+            </w:r>
+          </w:p>
+        </w:tc>
+        <w:tc>
+          <w:tcPr>
+            <w:tcW w:w="0" w:type="auto"/>
+            <w:vAlign w:val="center"/>
+            <w:hideMark/>
+          </w:tcPr>
+          <w:p>
+            <w:r>
+              <w:t>Simplified the admission-status function to return the Boolean condition directly.</w:t>
+            </w:r>
+          </w:p>
+        </w:tc>
+        <w:tc>
+          <w:tcPr>
+            <w:tcW w:w="0" w:type="auto"/>
+            <w:vAlign w:val="center"/>
+            <w:hideMark/>
+          </w:tcPr>
+          <w:p>
+            <w:r>
+              <w:t>Fixed</w:t>
+            </w:r>
+          </w:p>
+        </w:tc>
+      </w:tr>
+      <w:tr>
+        <w:trPr>
+          <w:tblCellSpacing w:w="15" w:type="dxa"/>
+        </w:trPr>
+        <w:tc>
+          <w:tcPr>
+            <w:tcW w:w="0" w:type="auto"/>
+            <w:vAlign w:val="center"/>
+            <w:hideMark/>
+          </w:tcPr>
+          <w:p>
+            <w:r>
+              <w:t>Broad exception handling</w:t>
+            </w:r>
+          </w:p>
+        </w:tc>
+        <w:tc>
+          <w:tcPr>
+            <w:tcW w:w="0" w:type="auto"/>
+            <w:vAlign w:val="center"/>
+            <w:hideMark/>
+          </w:tcPr>
+          <w:p>
+            <w:r>
+              <w:t>Removed the bare exception handling and handled missing patient records explicitly.</w:t>
+            </w:r>
+          </w:p>
+        </w:tc>
+        <w:tc>
+          <w:tcPr>
+            <w:tcW w:w="0" w:type="auto"/>
+            <w:vAlign w:val="center"/>
+            <w:hideMark/>
+          </w:tcPr>
+          <w:p>
+            <w:r>
+              <w:t>Fixed</w:t>
+            </w:r>
+          </w:p>
+        </w:tc>
+      </w:tr>
+      <w:tr>
+        <w:trPr>
+          <w:tblCellSpacing w:w="15" w:type="dxa"/>
+        </w:trPr>
+        <w:tc>
+          <w:tcPr>
+            <w:tcW w:w="0" w:type="auto"/>
+            <w:vAlign w:val="center"/>
+            <w:hideMark/>
+          </w:tcPr>
+          <w:p>
+            <w:r>
+              <w:t>Unsafe eval()</w:t>
+            </w:r>
+          </w:p>
+        </w:tc>
+        <w:tc>
+          <w:tcPr>
+            <w:tcW w:w="0" w:type="auto"/>
+            <w:vAlign w:val="center"/>
+            <w:hideMark/>
+          </w:tcPr>
+          <w:p>
+            <w:r>
+              <w:t>Replaced expression evaluation with a numeric multiplier and validation.</w:t>
+            </w:r>
+          </w:p>
+        </w:tc>
+        <w:tc>
+          <w:tcPr>
+            <w:tcW w:w="0" w:type="auto"/>
+            <w:vAlign w:val="center"/>
+            <w:hideMark/>
+          </w:tcPr>
+          <w:p>
+            <w:r>
+              <w:t>Fixed</w:t>
+            </w:r>
+          </w:p>
+        </w:tc>
+      </w:tr>
+      <w:tr>
+        <w:trPr>
+          <w:tblCellSpacing w:w="15" w:type="dxa"/>
+        </w:trPr>
+        <w:tc>
+          <w:tcPr>
+            <w:tcW w:w="0" w:type="auto"/>
+            <w:vAlign w:val="center"/>
+            <w:hideMark/>
+          </w:tcPr>
+          <w:p>
+            <w:r>
+              <w:t>Unused variable base_bill</w:t>
+            </w:r>
+          </w:p>
+        </w:tc>
+        <w:tc>
+          <w:tcPr>
+            <w:tcW w:w="0" w:type="auto"/>
+            <w:vAlign w:val="center"/>
+            <w:hideMark/>
+          </w:tcPr>
+          <w:p>
+            <w:r>
+              <w:t>Removed the unnecessary assignment while correcting the cost calculation.</w:t>
+            </w:r>
+          </w:p>
+        </w:tc>
+        <w:tc>
+          <w:tcPr>
+            <w:tcW w:w="0" w:type="auto"/>
+            <w:vAlign w:val="center"/>
+            <w:hideMark/>
+          </w:tcPr>
+          <w:p>
+            <w:r>
+              <w:t>Fixed</w:t>
+            </w:r>
+          </w:p>
+        </w:tc>
+      </w:tr>
+      <w:tr>
+        <w:trPr>
+          <w:tblCellSpacing w:w="15" w:type="dxa"/>
+        </w:trPr>
+        <w:tc>
+          <w:tcPr>
+            <w:tcW w:w="0" w:type="auto"/>
+            <w:vAlign w:val="center"/>
+            <w:hideMark/>
+          </w:tcPr>
+          <w:p>
+            <w:r>
+              <w:t>Weak MD5 hash</w:t>
+            </w:r>
+          </w:p>
+        </w:tc>
+        <w:tc>
+          <w:tcPr>
+            <w:tcW w:w="0" w:type="auto"/>
+            <w:vAlign w:val="center"/>
+            <w:hideMark/>
+          </w:tcPr>
+          <w:p>
+            <w:r>
+              <w:t>Replaced MD5 with SHA-256 using hashlib.sha256().</w:t>
+            </w:r>
+          </w:p>
+        </w:tc>
+        <w:tc>
+          <w:tcPr>
+            <w:tcW w:w="0" w:type="auto"/>
+            <w:vAlign w:val="center"/>
+            <w:hideMark/>
+          </w:tcPr>
+          <w:p>
+            <w:r>
+              <w:t>Fixed</w:t>
+            </w:r>
+          </w:p>
+        </w:tc>
+      </w:tr>
+      <w:tr>
+        <w:trPr>
+          <w:tblCellSpacing w:w="15" w:type="dxa"/>
+        </w:trPr>
+        <w:tc>
+          <w:tcPr>
+            <w:tcW w:w="0" w:type="auto"/>
+            <w:vAlign w:val="center"/>
+            <w:hideMark/>
+          </w:tcPr>
+          <w:p>
+            <w:r>
+              <w:t>Insecure random token generation</w:t>
+            </w:r>
+          </w:p>
+        </w:tc>
+        <w:tc>
+          <w:tcPr>
+            <w:tcW w:w="0" w:type="auto"/>
+            <w:vAlign w:val="center"/>
+            <w:hideMark/>
+          </w:tcPr>
+          <w:p>
+            <w:r>
+              <w:t>Replaced random.randint() with secrets.randbelow().</w:t>
+            </w:r>
+          </w:p>
+        </w:tc>
+        <w:tc>
+          <w:tcPr>
+            <w:tcW w:w="0" w:type="auto"/>
+            <w:vAlign w:val="center"/>
+            <w:hideMark/>
+          </w:tcPr>
+          <w:p>
+            <w:r>
+              <w:t>Fixed</w:t>
+            </w:r>
+          </w:p>
+        </w:tc>
+      </w:tr>
+      <w:tr>
+        <w:trPr>
+          <w:tblCellSpacing w:w="15" w:type="dxa"/>
+        </w:trPr>
+        <w:tc>
+          <w:tcPr>
+            <w:tcW w:w="0" w:type="auto"/>
+            <w:vAlign w:val="center"/>
+            <w:hideMark/>
+          </w:tcPr>
+          <w:p>
+            <w:r>
+              <w:t>File opened without encoding</w:t>
+            </w:r>
+          </w:p>
+        </w:tc>
+        <w:tc>
+          <w:tcPr>
+            <w:tcW w:w="0" w:type="auto"/>
+            <w:vAlign w:val="center"/>
+            <w:hideMark/>
+          </w:tcPr>
+          <w:p>
+            <w:r>
+              <w:t>Specified encoding="utf-8".</w:t>
+            </w:r>
+          </w:p>
+        </w:tc>
+        <w:tc>
+          <w:tcPr>
+            <w:tcW w:w="0" w:type="auto"/>
+            <w:vAlign w:val="center"/>
+            <w:hideMark/>
+          </w:tcPr>
+          <w:p>
+            <w:r>
+              <w:t>Fixed</w:t>
+            </w:r>
+          </w:p>
+        </w:tc>
+      </w:tr>
+      <w:tr>
+        <w:trPr>
+          <w:tblCellSpacing w:w="15" w:type="dxa"/>
+        </w:trPr>
+        <w:tc>
+          <w:tcPr>
+            <w:tcW w:w="0" w:type="auto"/>
+            <w:vAlign w:val="center"/>
+            <w:hideMark/>
+          </w:tcPr>
+          <w:p>
+            <w:r>
+              <w:lastRenderedPageBreak/>
+              <w:t>File resource handling</w:t>
+            </w:r>
+          </w:p>
+        </w:tc>
+        <w:tc>
+          <w:tcPr>
+            <w:tcW w:w="0" w:type="auto"/>
+            <w:vAlign w:val="center"/>
+            <w:hideMark/>
+          </w:tcPr>
+          <w:p>
+            <w:r>
+              <w:t>Used a with open(...) statement to close the file automatically.</w:t>
+            </w:r>
+          </w:p>
+        </w:tc>
+        <w:tc>
+          <w:tcPr>
+            <w:tcW w:w="0" w:type="auto"/>
+            <w:vAlign w:val="center"/>
+            <w:hideMark/>
+          </w:tcPr>
+          <w:p>
+            <w:r>
+              <w:t>Fixed</w:t>
+            </w:r>
+          </w:p>
+        </w:tc>
+      </w:tr>
+      <w:tr>
+        <w:trPr>
+          <w:tblCellSpacing w:w="15" w:type="dxa"/>
+        </w:trPr>
+        <w:tc>
+          <w:tcPr>
+            <w:tcW w:w="0" w:type="auto"/>
+            <w:vAlign w:val="center"/>
+            <w:hideMark/>
+          </w:tcPr>
+          <w:p>
+            <w:r>
+              <w:t>Shell command using a filename</w:t>
+            </w:r>
+          </w:p>
+        </w:tc>
+        <w:tc>
+          <w:tcPr>
+            <w:tcW w:w="0" w:type="auto"/>
+            <w:vAlign w:val="center"/>
+            <w:hideMark/>
+          </w:tcPr>
+          <w:p>
+            <w:r>
+              <w:t>Removed the os.system() call and used a normal Python print() statement.</w:t>
+            </w:r>
+          </w:p>
+        </w:tc>
+        <w:tc>
+          <w:tcPr>
+            <w:tcW w:w="0" w:type="auto"/>
+            <w:vAlign w:val="center"/>
+            <w:hideMark/>
+          </w:tcPr>
+          <w:p>
+            <w:r>
+              <w:t>Fixed</w:t>
+            </w:r>
+          </w:p>
+        </w:tc>
+      </w:tr>
+      <w:tr>
+        <w:trPr>
+          <w:tblCellSpacing w:w="15" w:type="dxa"/>
+        </w:trPr>
+        <w:tc>
+          <w:tcPr>
+            <w:tcW w:w="0" w:type="auto"/>
+            <w:vAlign w:val="center"/>
+            <w:hideMark/>
+          </w:tcPr>
+          <w:p>
+            <w:r>
+              <w:t>Redefined global name</w:t>
+            </w:r>
+          </w:p>
+        </w:tc>
+        <w:tc>
+          <w:tcPr>
+            <w:tcW w:w="0" w:type="auto"/>
+            <w:vAlign w:val="center"/>
+            <w:hideMark/>
+          </w:tcPr>
+          <w:p>
+            <w:r>
+              <w:t>Renamed the conflicting parameter to avoid shadowing the global variable.</w:t>
+            </w:r>
+          </w:p>
+        </w:tc>
+        <w:tc>
+          <w:tcPr>
+            <w:tcW w:w="0" w:type="auto"/>
+            <w:vAlign w:val="center"/>
+            <w:hideMark/>
+          </w:tcPr>
+          <w:p>
+            <w:r>
+              <w:t>Fixed</w:t>
+            </w:r>
+          </w:p>
+        </w:tc>
+      </w:tr>
+      <w:tr>
+        <w:trPr>
+          <w:tblCellSpacing w:w="15" w:type="dxa"/>
+        </w:trPr>
+        <w:tc>
+          <w:tcPr>
+            <w:tcW w:w="0" w:type="auto"/>
+            <w:vAlign w:val="center"/>
+            <w:hideMark/>
+          </w:tcPr>
+          <w:p>
+            <w:r>
+              <w:t>Unused loop variable</w:t>
+            </w:r>
+          </w:p>
+        </w:tc>
+        <w:tc>
+          <w:tcPr>
+            <w:tcW w:w="0" w:type="auto"/>
+            <w:vAlign w:val="center"/>
+            <w:hideMark/>
+          </w:tcPr>
+          <w:p>
+            <w:r>
+              <w:t>Rewrote the loop to use only the values required for the calculation.</w:t>
+            </w:r>
+          </w:p>
+        </w:tc>
+        <w:tc>
+          <w:tcPr>
+            <w:tcW w:w="0" w:type="auto"/>
+            <w:vAlign w:val="center"/>
+            <w:hideMark/>
+          </w:tcPr>
+          <w:p>
+            <w:r>
+              <w:t>Fixed</w:t>
+            </w:r>
+          </w:p>
+        </w:tc>
+      </w:tr>
+      <w:tr>
+        <w:trPr>
+          <w:tblCellSpacing w:w="15" w:type="dxa"/>
+        </w:trPr>
+        <w:tc>
+          <w:tcPr>
+            <w:tcW w:w="0" w:type="auto"/>
+            <w:vAlign w:val="center"/>
+            <w:hideMark/>
+          </w:tcPr>
+          <w:p>
+            <w:r>
+              <w:t>Hardcoded access key</w:t>
+            </w:r>
+          </w:p>
+        </w:tc>
+        <w:tc>
+          <w:tcPr>
+            <w:tcW w:w="0" w:type="auto"/>
+            <w:vAlign w:val="center"/>
+            <w:hideMark/>
+          </w:tcPr>
+          <w:p>
+            <w:r>
+              <w:t>Removed the hardcoded key and its print statement from the active code.</w:t>
+            </w:r>
+          </w:p>
+        </w:tc>
+        <w:tc>
+          <w:tcPr>
+            <w:tcW w:w="0" w:type="auto"/>
+            <w:vAlign w:val="center"/>
+            <w:hideMark/>
+          </w:tcPr>
+          <w:p>
+            <w:r>
+              <w:t>Fixed</w:t>
+            </w:r>
+          </w:p>
+        </w:tc>
+      </w:tr>
+      <w:tr>
+        <w:trPr>
+          <w:tblCellSpacing w:w="15" w:type="dxa"/>
+        </w:trPr>
+        <w:tc>
+          <w:tcPr>
+            <w:tcW w:w="0" w:type="auto"/>
+            <w:vAlign w:val="center"/>
+            <w:hideMark/>
+          </w:tcPr>
+          <w:p>
+            <w:r>
+              <w:t>Long lines</w:t>
+            </w:r>
+          </w:p>
+        </w:tc>
+        <w:tc>
+          <w:tcPr>
+            <w:tcW w:w="0" w:type="auto"/>
+            <w:vAlign w:val="center"/>
+            <w:hideMark/>
+          </w:tcPr>
+          <w:p>
+            <w:r>
+              <w:t>Split long statements and dictionary entries across multiple lines.</w:t>
+            </w:r>
+          </w:p>
+        </w:tc>
+        <w:tc>
+          <w:tcPr>
+            <w:tcW w:w="0" w:type="auto"/>
+            <w:vAlign w:val="center"/>
+            <w:hideMark/>
+          </w:tcPr>
+          <w:p>
+            <w:r>
+              <w:t>Fixed</w:t>
+            </w:r>
+          </w:p>
+        </w:tc>
+      </w:tr>
+      <w:tr>
+        <w:trPr>
+          <w:tblCellSpacing w:w="15" w:type="dxa"/>
+        </w:trPr>
+        <w:tc>
+          <w:tcPr>
+            <w:tcW w:w="0" w:type="auto"/>
+            <w:vAlign w:val="center"/>
+            <w:hideMark/>
+          </w:tcPr>
+          <w:p>
+            <w:r>
+              <w:t>Missing final newline</w:t>
+            </w:r>
+          </w:p>
+        </w:tc>
+        <w:tc>
+          <w:tcPr>
+            <w:tcW w:w="0" w:type="auto"/>
+            <w:vAlign w:val="center"/>
+            <w:hideMark/>
+          </w:tcPr>
+          <w:p>
+            <w:r>
+              <w:t>Added a newline at the end of the Python file.</w:t>
+            </w:r>
+          </w:p>
+        </w:tc>
+        <w:tc>
+          <w:tcPr>
+            <w:tcW w:w="0" w:type="auto"/>
+            <w:vAlign w:val="center"/>
+            <w:hideMark/>
+          </w:tcPr>
+          <w:p>
+            <w:r>
+              <w:t>Fixed</w:t>
+            </w:r>
+          </w:p>
+        </w:tc>
+      </w:tr>
+    </w:tbl>
+    <w:p>
+      <w:pPr>
+        <w:rPr>
+          <w:i/>
+          <w:iCs/>
+        </w:rPr>
+      </w:pPr>
+    </w:p>
+    <w:p>
+      <w:pPr>
+        <w:rPr>
+          <w:b/>
+          <w:bCs/>
+          <w:sz w:val="28"/>
+          <w:szCs w:val="28"/>
+        </w:rPr>
+      </w:pPr>
+      <w:r>
+        <w:rPr>
+          <w:b/>
+          <w:bCs/>
+          <w:sz w:val="28"/>
+          <w:szCs w:val="28"/>
+        </w:rPr>
+        <w:t>2. After-Fix Tool Results</w:t>
+      </w:r>
+    </w:p>
+    <w:p>
+      <w:r>
+        <w:rPr>
+          <w:b/>
+          <w:bCs/>
+        </w:rPr>
+        <w:t>A. Bandit — Security Analysis</w:t>
+      </w:r>
+    </w:p>
+    <w:p>
+      <w:r>
+        <w:t>Command executed:</w:t>
+      </w:r>
+    </w:p>
+    <w:p>
+      <w:r>
+        <w:t>python -m bandit -r hospital_patient_system.py</w:t>
+      </w:r>
+    </w:p>
+    <w:p>
+      <w:r>
+        <w:t>Result:</w:t>
+      </w:r>
+    </w:p>
+    <w:p>
+      <w:pPr>
+        <w:numPr>
+          <w:ilvl w:val="0"/>
+          <w:numId w:val="2"/>
+        </w:numPr>
+      </w:pPr>
+      <w:r>
+        <w:t>No issues identified.</w:t>
+      </w:r>
+    </w:p>
+    <w:p>
+      <w:pPr>
+        <w:numPr>
+          <w:ilvl w:val="0"/>
+          <w:numId w:val="2"/>
+        </w:numPr>
+      </w:pPr>
+      <w:r>
+        <w:t>High-severity issues: 0</w:t>
+      </w:r>
+    </w:p>
+    <w:p>
+      <w:pPr>
+        <w:numPr>
+          <w:ilvl w:val="0"/>
+          <w:numId w:val="2"/>
+        </w:numPr>
+      </w:pPr>
+      <w:r>
+        <w:t>Medium-severity issues: 0</w:t>
+      </w:r>
+    </w:p>
+    <w:p>
+      <w:pPr>
+        <w:numPr>
+          <w:ilvl w:val="0"/>
+          <w:numId w:val="2"/>
+        </w:numPr>
+      </w:pPr>
+      <w:r>
+        <w:t>Low-severity issues: 0</w:t>
+      </w:r>
+    </w:p>
+    <w:p>
+      <w:pPr>
+        <w:numPr>
+          <w:ilvl w:val="0"/>
+          <w:numId w:val="2"/>
+        </w:numPr>
+      </w:pPr>
+      <w:r>
+        <w:t>Total lines of code scanned: 74</w:t>
+      </w:r>
+    </w:p>
+    <w:p>
+      <w:r>
+        <w:rPr>
+          <w:b/>
+          <w:bCs/>
+        </w:rPr>
+        <w:t>Conclusion:</w:t>
+      </w:r>
+      <w:r>
+        <w:t xml:space="preserve"> Bandit did not identify any remaining security issues in the scanned Python file.</w:t>
+      </w:r>
+    </w:p>
+    <w:p/>
+    <w:p>
+      <w:r>
+        <w:rPr>
+          <w:b/>
+          <w:bCs/>
+        </w:rPr>
+        <w:t>B. Pylint — Code Quality Analysis</w:t>
+      </w:r>
+    </w:p>
+    <w:p>
+      <w:r>
+        <w:t>Command executed:</w:t>
+      </w:r>
+    </w:p>
+    <w:p>
+      <w:r>
+        <w:lastRenderedPageBreak/>
+        <w:t>pylint hospital_patient_system.py</w:t>
+      </w:r>
+    </w:p>
+    <w:p>
+      <w:r>
+        <w:t>Result:</w:t>
+      </w:r>
+    </w:p>
+    <w:p>
+      <w:r>
+        <w:t>Your code has been rated at 10.00/10</w:t>
+      </w:r>
+    </w:p>
+    <w:p>
+      <w:r>
+        <w:rPr>
+          <w:noProof/>
+        </w:rPr>
+        <w:drawing>
+          <wp:inline distT="0" distB="0" distL="0" distR="0" wp14:anchorId="7CDBD0CB" wp14:editId="7C873483">
+            <wp:extent cx="5731510" cy="1106170"/>
+            <wp:effectExtent l="0" t="0" r="2540" b="0"/>
+            <wp:docPr id="1375724411" name="Picture 1"/>
+            <wp:cNvGraphicFramePr>
+              <a:graphicFrameLocks xmlns:a="http://schemas.openxmlformats.org/drawingml/2006/main" noChangeAspect="1"/>
+            </wp:cNvGraphicFramePr>
+            <a:graphic xmlns:a="http://schemas.openxmlformats.org/drawingml/2006/main">
+              <a:graphicData uri="http://schemas.openxmlformats.org/drawingml/2006/picture">
+                <pic:pic xmlns:pic="http://schemas.openxmlformats.org/drawingml/2006/picture">
+                  <pic:nvPicPr>
+                    <pic:cNvPr id="1375724411" name=""/>
+                    <pic:cNvPicPr/>
+                  </pic:nvPicPr>
+                  <pic:blipFill>
+                    <a:blip r:embed="rId6"/>
+                    <a:stretch>
+                      <a:fillRect/>
+                    </a:stretch>
+                  </pic:blipFill>
+                  <pic:spPr>
+                    <a:xfrm>
+                      <a:off x="0" y="0"/>
+                      <a:ext cx="5731510" cy="1106170"/>
+                    </a:xfrm>
+                    <a:prstGeom prst="rect">
+                      <a:avLst/>
+                    </a:prstGeom>
+                  </pic:spPr>
+                </pic:pic>
+              </a:graphicData>
+            </a:graphic>
+          </wp:inline>
+        </w:drawing>
+      </w:r>
+    </w:p>
+    <w:p>
+      <w:r>
+        <w:rPr>
+          <w:b/>
+          <w:bCs/>
+        </w:rPr>
+        <w:t>Conclusion:</w:t>
+      </w:r>
+      <w:r>
+        <w:t xml:space="preserve"> The final Pylint score is 10.00/10, exceeding the required score of 9.5/10.</w:t>
+      </w:r>
+    </w:p>
+    <w:p/>
+    <w:p>
+      <w:r>
+        <w:rPr>
+          <w:b/>
+          <w:bCs/>
+        </w:rPr>
+        <w:t>C. Flake8 — Formatting Analysis</w:t>
+      </w:r>
+    </w:p>
+    <w:p>
+      <w:r>
+        <w:t>Command executed:</w:t>
+      </w:r>
+    </w:p>
+    <w:p>
+      <w:r>
+        <w:t>python -m flake8 hospital_patient_system.py</w:t>
+      </w:r>
+    </w:p>
+    <w:p>
+      <w:r>
+        <w:t>Result:</w:t>
+      </w:r>
+    </w:p>
+    <w:p>
+      <w:r>
+        <w:t>No output was produced after the final formatting fixes.</w:t>
+      </w:r>
+    </w:p>
+    <w:p>
+      <w:r>
+        <w:rPr>
+          <w:b/>
+          <w:bCs/>
+        </w:rPr>
+        <w:t>Conclusion:</w:t>
+      </w:r>
+      <w:r>
+        <w:t xml:space="preserve"> Flake8 reported no remaining violations, provided the command was run successfully on the final version of the file.</w:t>
+      </w:r>
+    </w:p>
+    <w:p>
+      <w:pPr>
+        <w:rPr>
+          <w:b/>
+          <w:bCs/>
+        </w:rPr>
+      </w:pPr>
+      <w:r>
+        <w:rPr>
+          <w:b/>
+          <w:bCs/>
+        </w:rPr>
+        <w:t>3. Overall Conclusion</w:t>
+      </w:r>
+    </w:p>
+    <w:p>
+      <w:r>
+        <w:t>The original hospital patient management program was improved by addressing security risks, code-quality problems, and formatting violations. The updated program uses safer hashing and token generation, validates treatment-cost inputs, handles files more reliably, and follows Python naming and documentation conventions.</w:t>
+      </w:r>
+    </w:p>
+    <w:p>
+      <w:r>
+        <w:t>The final verification results show a Pylint score of 10.00/10, no issues identified by Bandit, and no Flake8 output. These results indicate that the identified issues have been addressed</w:t>
+      </w:r>
+      <w:r>
+        <w:t>.</w:t>
+      </w:r>
+    </w:p>
+    <w:p/>
     <w:sectPr>
       <w:pgSz w:w="11906" w:h="16838"/>
       <w:pgMar w:top="1440" w:right="1440" w:bottom="1440" w:left="1440" w:header="708" w:footer="708" w:gutter="0"/>
@@ -1661,6 +2960,315 @@
     </w:sectPr>
   </w:body>
 </w:document>
+</file>
+
+<file path=word/numbering.xml><?xml version="1.0" encoding="utf-8"?>
+<w:numbering xmlns:wpc="http://schemas.microsoft.com/office/word/2010/wordprocessingCanvas" xmlns:cx="http://schemas.microsoft.com/office/drawing/2014/chartex" xmlns:cx1="http://schemas.microsoft.com/office/drawing/2015/9/8/chartex" xmlns:cx2="http://schemas.microsoft.com/office/drawing/2015/10/21/chartex" xmlns:cx3="http://schemas.microsoft.com/office/drawing/2016/5/9/chartex" xmlns:cx4="http://schemas.microsoft.com/office/drawing/2016/5/10/chartex" xmlns:cx5="http://schemas.microsoft.com/office/drawing/2016/5/11/chartex" xmlns:cx6="http://schemas.microsoft.com/office/drawing/2016/5/12/chartex" xmlns:cx7="http://schemas.microsoft.com/office/drawing/2016/5/13/chartex" xmlns:cx8="http://schemas.microsoft.com/office/drawing/2016/5/14/chartex" xmlns:mc="http://schemas.openxmlformats.org/markup-compatibility/2006" xmlns:aink="http://schemas.microsoft.com/office/drawing/2016/ink" xmlns:am3d="http://schemas.microsoft.com/office/drawing/2017/model3d" xmlns:o="urn:schemas-microsoft-com:office:office" xmlns:oel="http://schemas.microsoft.com/office/2019/extlst" xmlns:r="http://schemas.openxmlformats.org/officeDocument/2006/relationships" xmlns:m="http://schemas.openxmlformats.org/officeDocument/2006/math" xmlns:v="urn:schemas-microsoft-com:vml" xmlns:wp14="http://schemas.microsoft.com/office/word/2010/wordprocessingDrawing" xmlns:wp="http://schemas.openxmlformats.org/drawingml/2006/wordprocessingDrawing" xmlns:w10="urn:schemas-microsoft-com:office:word" xmlns:w="http://schemas.openxmlformats.org/wordprocessingml/2006/main" xmlns:w14="http://schemas.microsoft.com/office/word/2010/wordml" xmlns:w15="http://schemas.microsoft.com/office/word/2012/wordml" xmlns:w16cex="http://schemas.microsoft.com/office/word/2018/wordml/cex" xmlns:w16cid="http://schemas.microsoft.com/office/word/2016/wordml/cid" xmlns:w16="http://schemas.microsoft.com/office/word/2018/wordml" xmlns:w16du="http://schemas.microsoft.com/office/word/2023/wordml/word16du" xmlns:w16sdtdh="http://schemas.microsoft.com/office/word/2020/wordml/sdtdatahash" xmlns:w16sdtfl="http://schemas.microsoft.com/office/word/2024/wordml/sdtformatlock" xmlns:w16se="http://schemas.microsoft.com/office/word/2015/wordml/symex" xmlns:wpg="http://schemas.microsoft.com/office/word/2010/wordprocessingGroup" xmlns:wpi="http://schemas.microsoft.com/office/word/2010/wordprocessingInk" xmlns:wne="http://schemas.microsoft.com/office/word/2006/wordml" xmlns:wps="http://schemas.microsoft.com/office/word/2010/wordprocessingShape" mc:Ignorable="w14 w15 w16se w16cid w16 w16cex w16sdtdh w16sdtfl w16du wp14">
+  <w:abstractNum w:abstractNumId="0" w15:restartNumberingAfterBreak="0">
+    <w:nsid w:val="3F990AFB"/>
+    <w:multiLevelType w:val="multilevel"/>
+    <w:tmpl w:val="EC54F19E"/>
+    <w:lvl w:ilvl="0">
+      <w:start w:val="1"/>
+      <w:numFmt w:val="bullet"/>
+      <w:lvlText w:val=""/>
+      <w:lvlJc w:val="left"/>
+      <w:pPr>
+        <w:tabs>
+          <w:tab w:val="num" w:pos="720"/>
+        </w:tabs>
+        <w:ind w:left="720" w:hanging="360"/>
+      </w:pPr>
+      <w:rPr>
+        <w:rFonts w:ascii="Symbol" w:hAnsi="Symbol" w:hint="default"/>
+        <w:sz w:val="20"/>
+      </w:rPr>
+    </w:lvl>
+    <w:lvl w:ilvl="1" w:tentative="1">
+      <w:start w:val="1"/>
+      <w:numFmt w:val="bullet"/>
+      <w:lvlText w:val="o"/>
+      <w:lvlJc w:val="left"/>
+      <w:pPr>
+        <w:tabs>
+          <w:tab w:val="num" w:pos="1440"/>
+        </w:tabs>
+        <w:ind w:left="1440" w:hanging="360"/>
+      </w:pPr>
+      <w:rPr>
+        <w:rFonts w:ascii="Courier New" w:hAnsi="Courier New" w:hint="default"/>
+        <w:sz w:val="20"/>
+      </w:rPr>
+    </w:lvl>
+    <w:lvl w:ilvl="2" w:tentative="1">
+      <w:start w:val="1"/>
+      <w:numFmt w:val="bullet"/>
+      <w:lvlText w:val=""/>
+      <w:lvlJc w:val="left"/>
+      <w:pPr>
+        <w:tabs>
+          <w:tab w:val="num" w:pos="2160"/>
+        </w:tabs>
+        <w:ind w:left="2160" w:hanging="360"/>
+      </w:pPr>
+      <w:rPr>
+        <w:rFonts w:ascii="Wingdings" w:hAnsi="Wingdings" w:hint="default"/>
+        <w:sz w:val="20"/>
+      </w:rPr>
+    </w:lvl>
+    <w:lvl w:ilvl="3" w:tentative="1">
+      <w:start w:val="1"/>
+      <w:numFmt w:val="bullet"/>
+      <w:lvlText w:val=""/>
+      <w:lvlJc w:val="left"/>
+      <w:pPr>
+        <w:tabs>
+          <w:tab w:val="num" w:pos="2880"/>
+        </w:tabs>
+        <w:ind w:left="2880" w:hanging="360"/>
+      </w:pPr>
+      <w:rPr>
+        <w:rFonts w:ascii="Wingdings" w:hAnsi="Wingdings" w:hint="default"/>
+        <w:sz w:val="20"/>
+      </w:rPr>
+    </w:lvl>
+    <w:lvl w:ilvl="4" w:tentative="1">
+      <w:start w:val="1"/>
+      <w:numFmt w:val="bullet"/>
+      <w:lvlText w:val=""/>
+      <w:lvlJc w:val="left"/>
+      <w:pPr>
+        <w:tabs>
+          <w:tab w:val="num" w:pos="3600"/>
+        </w:tabs>
+        <w:ind w:left="3600" w:hanging="360"/>
+      </w:pPr>
+      <w:rPr>
+        <w:rFonts w:ascii="Wingdings" w:hAnsi="Wingdings" w:hint="default"/>
+        <w:sz w:val="20"/>
+      </w:rPr>
+    </w:lvl>
+    <w:lvl w:ilvl="5" w:tentative="1">
+      <w:start w:val="1"/>
+      <w:numFmt w:val="bullet"/>
+      <w:lvlText w:val=""/>
+      <w:lvlJc w:val="left"/>
+      <w:pPr>
+        <w:tabs>
+          <w:tab w:val="num" w:pos="4320"/>
+        </w:tabs>
+        <w:ind w:left="4320" w:hanging="360"/>
+      </w:pPr>
+      <w:rPr>
+        <w:rFonts w:ascii="Wingdings" w:hAnsi="Wingdings" w:hint="default"/>
+        <w:sz w:val="20"/>
+      </w:rPr>
+    </w:lvl>
+    <w:lvl w:ilvl="6" w:tentative="1">
+      <w:start w:val="1"/>
+      <w:numFmt w:val="bullet"/>
+      <w:lvlText w:val=""/>
+      <w:lvlJc w:val="left"/>
+      <w:pPr>
+        <w:tabs>
+          <w:tab w:val="num" w:pos="5040"/>
+        </w:tabs>
+        <w:ind w:left="5040" w:hanging="360"/>
+      </w:pPr>
+      <w:rPr>
+        <w:rFonts w:ascii="Wingdings" w:hAnsi="Wingdings" w:hint="default"/>
+        <w:sz w:val="20"/>
+      </w:rPr>
+    </w:lvl>
+    <w:lvl w:ilvl="7" w:tentative="1">
+      <w:start w:val="1"/>
+      <w:numFmt w:val="bullet"/>
+      <w:lvlText w:val=""/>
+      <w:lvlJc w:val="left"/>
+      <w:pPr>
+        <w:tabs>
+          <w:tab w:val="num" w:pos="5760"/>
+        </w:tabs>
+        <w:ind w:left="5760" w:hanging="360"/>
+      </w:pPr>
+      <w:rPr>
+        <w:rFonts w:ascii="Wingdings" w:hAnsi="Wingdings" w:hint="default"/>
+        <w:sz w:val="20"/>
+      </w:rPr>
+    </w:lvl>
+    <w:lvl w:ilvl="8" w:tentative="1">
+      <w:start w:val="1"/>
+      <w:numFmt w:val="bullet"/>
+      <w:lvlText w:val=""/>
+      <w:lvlJc w:val="left"/>
+      <w:pPr>
+        <w:tabs>
+          <w:tab w:val="num" w:pos="6480"/>
+        </w:tabs>
+        <w:ind w:left="6480" w:hanging="360"/>
+      </w:pPr>
+      <w:rPr>
+        <w:rFonts w:ascii="Wingdings" w:hAnsi="Wingdings" w:hint="default"/>
+        <w:sz w:val="20"/>
+      </w:rPr>
+    </w:lvl>
+  </w:abstractNum>
+  <w:abstractNum w:abstractNumId="1" w15:restartNumberingAfterBreak="0">
+    <w:nsid w:val="76A91144"/>
+    <w:multiLevelType w:val="multilevel"/>
+    <w:tmpl w:val="12827792"/>
+    <w:lvl w:ilvl="0">
+      <w:start w:val="1"/>
+      <w:numFmt w:val="bullet"/>
+      <w:lvlText w:val=""/>
+      <w:lvlJc w:val="left"/>
+      <w:pPr>
+        <w:tabs>
+          <w:tab w:val="num" w:pos="720"/>
+        </w:tabs>
+        <w:ind w:left="720" w:hanging="360"/>
+      </w:pPr>
+      <w:rPr>
+        <w:rFonts w:ascii="Symbol" w:hAnsi="Symbol" w:hint="default"/>
+        <w:sz w:val="20"/>
+      </w:rPr>
+    </w:lvl>
+    <w:lvl w:ilvl="1" w:tentative="1">
+      <w:start w:val="1"/>
+      <w:numFmt w:val="bullet"/>
+      <w:lvlText w:val="o"/>
+      <w:lvlJc w:val="left"/>
+      <w:pPr>
+        <w:tabs>
+          <w:tab w:val="num" w:pos="1440"/>
+        </w:tabs>
+        <w:ind w:left="1440" w:hanging="360"/>
+      </w:pPr>
+      <w:rPr>
+        <w:rFonts w:ascii="Courier New" w:hAnsi="Courier New" w:hint="default"/>
+        <w:sz w:val="20"/>
+      </w:rPr>
+    </w:lvl>
+    <w:lvl w:ilvl="2" w:tentative="1">
+      <w:start w:val="1"/>
+      <w:numFmt w:val="bullet"/>
+      <w:lvlText w:val=""/>
+      <w:lvlJc w:val="left"/>
+      <w:pPr>
+        <w:tabs>
+          <w:tab w:val="num" w:pos="2160"/>
+        </w:tabs>
+        <w:ind w:left="2160" w:hanging="360"/>
+      </w:pPr>
+      <w:rPr>
+        <w:rFonts w:ascii="Wingdings" w:hAnsi="Wingdings" w:hint="default"/>
+        <w:sz w:val="20"/>
+      </w:rPr>
+    </w:lvl>
+    <w:lvl w:ilvl="3" w:tentative="1">
+      <w:start w:val="1"/>
+      <w:numFmt w:val="bullet"/>
+      <w:lvlText w:val=""/>
+      <w:lvlJc w:val="left"/>
+      <w:pPr>
+        <w:tabs>
+          <w:tab w:val="num" w:pos="2880"/>
+        </w:tabs>
+        <w:ind w:left="2880" w:hanging="360"/>
+      </w:pPr>
+      <w:rPr>
+        <w:rFonts w:ascii="Wingdings" w:hAnsi="Wingdings" w:hint="default"/>
+        <w:sz w:val="20"/>
+      </w:rPr>
+    </w:lvl>
+    <w:lvl w:ilvl="4" w:tentative="1">
+      <w:start w:val="1"/>
+      <w:numFmt w:val="bullet"/>
+      <w:lvlText w:val=""/>
+      <w:lvlJc w:val="left"/>
+      <w:pPr>
+        <w:tabs>
+          <w:tab w:val="num" w:pos="3600"/>
+        </w:tabs>
+        <w:ind w:left="3600" w:hanging="360"/>
+      </w:pPr>
+      <w:rPr>
+        <w:rFonts w:ascii="Wingdings" w:hAnsi="Wingdings" w:hint="default"/>
+        <w:sz w:val="20"/>
+      </w:rPr>
+    </w:lvl>
+    <w:lvl w:ilvl="5" w:tentative="1">
+      <w:start w:val="1"/>
+      <w:numFmt w:val="bullet"/>
+      <w:lvlText w:val=""/>
+      <w:lvlJc w:val="left"/>
+      <w:pPr>
+        <w:tabs>
+          <w:tab w:val="num" w:pos="4320"/>
+        </w:tabs>
+        <w:ind w:left="4320" w:hanging="360"/>
+      </w:pPr>
+      <w:rPr>
+        <w:rFonts w:ascii="Wingdings" w:hAnsi="Wingdings" w:hint="default"/>
+        <w:sz w:val="20"/>
+      </w:rPr>
+    </w:lvl>
+    <w:lvl w:ilvl="6" w:tentative="1">
+      <w:start w:val="1"/>
+      <w:numFmt w:val="bullet"/>
+      <w:lvlText w:val=""/>
+      <w:lvlJc w:val="left"/>
+      <w:pPr>
+        <w:tabs>
+          <w:tab w:val="num" w:pos="5040"/>
+        </w:tabs>
+        <w:ind w:left="5040" w:hanging="360"/>
+      </w:pPr>
+      <w:rPr>
+        <w:rFonts w:ascii="Wingdings" w:hAnsi="Wingdings" w:hint="default"/>
+        <w:sz w:val="20"/>
+      </w:rPr>
+    </w:lvl>
+    <w:lvl w:ilvl="7" w:tentative="1">
+      <w:start w:val="1"/>
+      <w:numFmt w:val="bullet"/>
+      <w:lvlText w:val=""/>
+      <w:lvlJc w:val="left"/>
+      <w:pPr>
+        <w:tabs>
+          <w:tab w:val="num" w:pos="5760"/>
+        </w:tabs>
+        <w:ind w:left="5760" w:hanging="360"/>
+      </w:pPr>
+      <w:rPr>
+        <w:rFonts w:ascii="Wingdings" w:hAnsi="Wingdings" w:hint="default"/>
+        <w:sz w:val="20"/>
+      </w:rPr>
+    </w:lvl>
+    <w:lvl w:ilvl="8" w:tentative="1">
+      <w:start w:val="1"/>
+      <w:numFmt w:val="bullet"/>
+      <w:lvlText w:val=""/>
+      <w:lvlJc w:val="left"/>
+      <w:pPr>
+        <w:tabs>
+          <w:tab w:val="num" w:pos="6480"/>
+        </w:tabs>
+        <w:ind w:left="6480" w:hanging="360"/>
+      </w:pPr>
+      <w:rPr>
+        <w:rFonts w:ascii="Wingdings" w:hAnsi="Wingdings" w:hint="default"/>
+        <w:sz w:val="20"/>
+      </w:rPr>
+    </w:lvl>
+  </w:abstractNum>
+  <w:num w:numId="1" w16cid:durableId="1995406176">
+    <w:abstractNumId w:val="0"/>
+  </w:num>
+  <w:num w:numId="2" w16cid:durableId="1109545533">
+    <w:abstractNumId w:val="1"/>
+  </w:num>
+</w:numbering>
 </file>
 
 <file path=word/styles.xml><?xml version="1.0" encoding="utf-8"?>

</xml_diff>